<commit_message>
Add enterprise KPI collectors and evidence harness
</commit_message>
<xml_diff>
--- a/docs/Tijara_Suite_Screenshot_User_Guide.docx
+++ b/docs/Tijara_Suite_Screenshot_User_Guide.docx
@@ -289,6 +289,198 @@
           </w:tcPr>
           <w:p>
             <w:r>
+              <w:t>expense_manager</w:t>
+            </w:r>
+          </w:p>
+        </w:tc>
+        <w:tc>
+          <w:tcPr>
+            <w:tcW w:type="dxa" w:w="3360"/>
+          </w:tcPr>
+          <w:p>
+            <w:r>
+              <w:t>expense-manager@demo.tijara-suite.local</w:t>
+            </w:r>
+          </w:p>
+        </w:tc>
+        <w:tc>
+          <w:tcPr>
+            <w:tcW w:type="dxa" w:w="3360"/>
+          </w:tcPr>
+          <w:p>
+            <w:r>
+              <w:t>Submit, approve, pay, and export business expense records.</w:t>
+            </w:r>
+          </w:p>
+        </w:tc>
+      </w:tr>
+      <w:tr>
+        <w:tc>
+          <w:tcPr>
+            <w:tcW w:type="dxa" w:w="3360"/>
+          </w:tcPr>
+          <w:p>
+            <w:r>
+              <w:t>salary_manager</w:t>
+            </w:r>
+          </w:p>
+        </w:tc>
+        <w:tc>
+          <w:tcPr>
+            <w:tcW w:type="dxa" w:w="3360"/>
+          </w:tcPr>
+          <w:p>
+            <w:r>
+              <w:t>salary-manager@demo.tijara-suite.local</w:t>
+            </w:r>
+          </w:p>
+        </w:tc>
+        <w:tc>
+          <w:tcPr>
+            <w:tcW w:type="dxa" w:w="3360"/>
+          </w:tcPr>
+          <w:p>
+            <w:r>
+              <w:t>Review gross pay, deductions, bonuses, approvals, and payroll payment status.</w:t>
+            </w:r>
+          </w:p>
+        </w:tc>
+      </w:tr>
+      <w:tr>
+        <w:tc>
+          <w:tcPr>
+            <w:tcW w:type="dxa" w:w="3360"/>
+          </w:tcPr>
+          <w:p>
+            <w:r>
+              <w:t>loyalty_manager</w:t>
+            </w:r>
+          </w:p>
+        </w:tc>
+        <w:tc>
+          <w:tcPr>
+            <w:tcW w:type="dxa" w:w="3360"/>
+          </w:tcPr>
+          <w:p>
+            <w:r>
+              <w:t>loyalty-manager@demo.tijara-suite.local</w:t>
+            </w:r>
+          </w:p>
+        </w:tc>
+        <w:tc>
+          <w:tcPr>
+            <w:tcW w:type="dxa" w:w="3360"/>
+          </w:tcPr>
+          <w:p>
+            <w:r>
+              <w:t>Manage walk-in customers, B2B/B2C details, loyalty tiers, point balances, and retention history.</w:t>
+            </w:r>
+          </w:p>
+        </w:tc>
+      </w:tr>
+      <w:tr>
+        <w:tc>
+          <w:tcPr>
+            <w:tcW w:type="dxa" w:w="3360"/>
+          </w:tcPr>
+          <w:p>
+            <w:r>
+              <w:t>vertical_manager</w:t>
+            </w:r>
+          </w:p>
+        </w:tc>
+        <w:tc>
+          <w:tcPr>
+            <w:tcW w:type="dxa" w:w="3360"/>
+          </w:tcPr>
+          <w:p>
+            <w:r>
+              <w:t>vertical-manager@demo.tijara-suite.local</w:t>
+            </w:r>
+          </w:p>
+        </w:tc>
+        <w:tc>
+          <w:tcPr>
+            <w:tcW w:type="dxa" w:w="3360"/>
+          </w:tcPr>
+          <w:p>
+            <w:r>
+              <w:t>Maintain vertical catalog settings, B2B/B2C prices, GST, service charge, delivery charge, and food-service tax policy.</w:t>
+            </w:r>
+          </w:p>
+        </w:tc>
+      </w:tr>
+      <w:tr>
+        <w:tc>
+          <w:tcPr>
+            <w:tcW w:type="dxa" w:w="3360"/>
+          </w:tcPr>
+          <w:p>
+            <w:r>
+              <w:t>promotion_manager</w:t>
+            </w:r>
+          </w:p>
+        </w:tc>
+        <w:tc>
+          <w:tcPr>
+            <w:tcW w:type="dxa" w:w="3360"/>
+          </w:tcPr>
+          <w:p>
+            <w:r>
+              <w:t>promotion-manager@demo.tijara-suite.local</w:t>
+            </w:r>
+          </w:p>
+        </w:tc>
+        <w:tc>
+          <w:tcPr>
+            <w:tcW w:type="dxa" w:w="3360"/>
+          </w:tcPr>
+          <w:p>
+            <w:r>
+              <w:t>Publish promotions, menu boards, deals boards, queue displays, and customer-facing messages.</w:t>
+            </w:r>
+          </w:p>
+        </w:tc>
+      </w:tr>
+      <w:tr>
+        <w:tc>
+          <w:tcPr>
+            <w:tcW w:type="dxa" w:w="3360"/>
+          </w:tcPr>
+          <w:p>
+            <w:r>
+              <w:t>analytics_manager</w:t>
+            </w:r>
+          </w:p>
+        </w:tc>
+        <w:tc>
+          <w:tcPr>
+            <w:tcW w:type="dxa" w:w="3360"/>
+          </w:tcPr>
+          <w:p>
+            <w:r>
+              <w:t>analytics-manager@demo.tijara-suite.local</w:t>
+            </w:r>
+          </w:p>
+        </w:tc>
+        <w:tc>
+          <w:tcPr>
+            <w:tcW w:type="dxa" w:w="3360"/>
+          </w:tcPr>
+          <w:p>
+            <w:r>
+              <w:t>Review dashboards, KPI history, trend charts, vertical sales, loyalty, expenses, salaries, and charge policy analytics.</w:t>
+            </w:r>
+          </w:p>
+        </w:tc>
+      </w:tr>
+      <w:tr>
+        <w:tc>
+          <w:tcPr>
+            <w:tcW w:type="dxa" w:w="3360"/>
+          </w:tcPr>
+          <w:p>
+            <w:r>
               <w:t>restaurant_operator</w:t>
             </w:r>
           </w:p>
@@ -377,7 +569,7 @@
       <w:r>
         <w:drawing>
           <wp:inline xmlns:a="http://schemas.openxmlformats.org/drawingml/2006/main" xmlns:pic="http://schemas.openxmlformats.org/drawingml/2006/picture">
-            <wp:extent cx="6035040" cy="3771900"/>
+            <wp:extent cx="6035040" cy="4031742"/>
             <wp:docPr id="1" name="Picture 1"/>
             <wp:cNvGraphicFramePr>
               <a:graphicFrameLocks noChangeAspect="1"/>
@@ -398,7 +590,7 @@
                   <pic:spPr>
                     <a:xfrm>
                       <a:off x="0" y="0"/>
-                      <a:ext cx="6035040" cy="3771900"/>
+                      <a:ext cx="6035040" cy="4031742"/>
                     </a:xfrm>
                     <a:prstGeom prst="rect"/>
                   </pic:spPr>
@@ -548,12 +740,12 @@
         <w:pStyle w:val="Heading2"/>
       </w:pPr>
       <w:r>
-        <w:t>3. Kiosk Self Ordering</w:t>
+        <w:t>3. Expense Management</w:t>
       </w:r>
     </w:p>
     <w:p>
       <w:r>
-        <w:t>The kiosk route supports dine-in, takeaway, pickup, B2C/B2B pricing, PKR prices, customer details, payment selection, and checkout.</w:t>
+        <w:t>Expense managers submit, approve, cancel, mark paid, and audit back-office expense requests in PKR with tax amounts and receipt references.</w:t>
       </w:r>
     </w:p>
     <w:p>
@@ -569,7 +761,7 @@
               <a:graphicData uri="http://schemas.openxmlformats.org/drawingml/2006/picture">
                 <pic:pic>
                   <pic:nvPicPr>
-                    <pic:cNvPr id="0" name="kiosk-display.png"/>
+                    <pic:cNvPr id="0" name="expense-management.png"/>
                     <pic:cNvPicPr/>
                   </pic:nvPicPr>
                   <pic:blipFill>
@@ -602,7 +794,7 @@
           <w:color w:val="555555"/>
           <w:sz w:val="18"/>
         </w:rPr>
-        <w:t>Figure 3: Kiosk Self Ordering captured from live local Odoo.</w:t>
+        <w:t>Figure 3: Expense Management captured from live local Odoo.</w:t>
       </w:r>
     </w:p>
     <w:p>
@@ -611,7 +803,7 @@
         <w:spacing w:after="80"/>
       </w:pPr>
       <w:r>
-        <w:t>Open `/tijara/display/tijara-demo-kiosk?db=tijara_dev` on a kiosk or tablet.</w:t>
+        <w:t>Open Retail Operations &gt; Back Office &gt; Expenses.</w:t>
       </w:r>
     </w:p>
     <w:p>
@@ -620,7 +812,7 @@
         <w:spacing w:after="80"/>
       </w:pPr>
       <w:r>
-        <w:t>Choose the service mode and customer type.</w:t>
+        <w:t>Create or review an expense with vendor or employee, category, payment method, amount, tax, and receipt reference.</w:t>
       </w:r>
     </w:p>
     <w:p>
@@ -629,7 +821,7 @@
         <w:spacing w:after="80"/>
       </w:pPr>
       <w:r>
-        <w:t>Tap products to add them to the cart, enter customer details when needed, and press Checkout.</w:t>
+        <w:t>Move the request through submitted, approved, and paid states so finance dashboards can collect the expense pipeline.</w:t>
       </w:r>
     </w:p>
     <w:p>
@@ -637,12 +829,12 @@
         <w:pStyle w:val="Heading2"/>
       </w:pPr>
       <w:r>
-        <w:t>4. Customer Display</w:t>
+        <w:t>4. Salary Management</w:t>
       </w:r>
     </w:p>
     <w:p>
       <w:r>
-        <w:t>The customer-facing display shows the live order reference, item lines, quantities, PKR subtotal, discount, tax, and total.</w:t>
+        <w:t>Salary batches track employees, roles, gross pay, deductions, bonuses, net payable, approval, and paid status.</w:t>
       </w:r>
     </w:p>
     <w:p>
@@ -658,7 +850,7 @@
               <a:graphicData uri="http://schemas.openxmlformats.org/drawingml/2006/picture">
                 <pic:pic>
                   <pic:nvPicPr>
-                    <pic:cNvPr id="0" name="customer-display.png"/>
+                    <pic:cNvPr id="0" name="salary-management.png"/>
                     <pic:cNvPicPr/>
                   </pic:nvPicPr>
                   <pic:blipFill>
@@ -691,7 +883,7 @@
           <w:color w:val="555555"/>
           <w:sz w:val="18"/>
         </w:rPr>
-        <w:t>Figure 4: Customer Display captured from live local Odoo.</w:t>
+        <w:t>Figure 4: Salary Management captured from live local Odoo.</w:t>
       </w:r>
     </w:p>
     <w:p>
@@ -700,7 +892,7 @@
         <w:spacing w:after="80"/>
       </w:pPr>
       <w:r>
-        <w:t>Open `/tijara/display/tijara-demo-customer-display?db=tijara_dev` on the customer-side display.</w:t>
+        <w:t>Open Retail Operations &gt; Back Office &gt; Salaries.</w:t>
       </w:r>
     </w:p>
     <w:p>
@@ -709,7 +901,7 @@
         <w:spacing w:after="80"/>
       </w:pPr>
       <w:r>
-        <w:t>Keep it full screen near the POS counter.</w:t>
+        <w:t>Review salary lines for the month or payroll period.</w:t>
       </w:r>
     </w:p>
     <w:p>
@@ -718,7 +910,7 @@
         <w:spacing w:after="80"/>
       </w:pPr>
       <w:r>
-        <w:t>Use it to verify cart lines, discounts, GST, and totals with the customer before payment.</w:t>
+        <w:t>Approve the batch and mark it paid after finance sign-off.</w:t>
       </w:r>
     </w:p>
     <w:p>
@@ -731,12 +923,12 @@
         <w:pStyle w:val="Heading2"/>
       </w:pPr>
       <w:r>
-        <w:t>5. Queue Display</w:t>
+        <w:t>5. Loyalty Customer Records</w:t>
       </w:r>
     </w:p>
     <w:p>
       <w:r>
-        <w:t>The queue display shows waiting, preparing, ready, and called tickets in large, readable cards for restaurant, bakery, and pickup counters.</w:t>
+        <w:t>Customer records support walk-in details, B2B/B2C customer type, CNIC/NTN/STRN fields, loyalty opt-in, tier, and points.</w:t>
       </w:r>
     </w:p>
     <w:p>
@@ -752,7 +944,7 @@
               <a:graphicData uri="http://schemas.openxmlformats.org/drawingml/2006/picture">
                 <pic:pic>
                   <pic:nvPicPr>
-                    <pic:cNvPr id="0" name="queue-display.png"/>
+                    <pic:cNvPr id="0" name="loyalty-customer-records.png"/>
                     <pic:cNvPicPr/>
                   </pic:nvPicPr>
                   <pic:blipFill>
@@ -785,7 +977,7 @@
           <w:color w:val="555555"/>
           <w:sz w:val="18"/>
         </w:rPr>
-        <w:t>Figure 5: Queue Display captured from live local Odoo.</w:t>
+        <w:t>Figure 5: Loyalty Customer Records captured from live local Odoo.</w:t>
       </w:r>
     </w:p>
     <w:p>
@@ -794,7 +986,7 @@
         <w:spacing w:after="80"/>
       </w:pPr>
       <w:r>
-        <w:t>Open `/tijara/display/tijara-demo-queue-display?db=tijara_dev` on a public screen.</w:t>
+        <w:t>Open Contacts or the Loyalty Customer Records screen.</w:t>
       </w:r>
     </w:p>
     <w:p>
@@ -803,7 +995,7 @@
         <w:spacing w:after="80"/>
       </w:pPr>
       <w:r>
-        <w:t>Use queue tickets from kiosk or POS orders.</w:t>
+        <w:t>Search by name, mobile, email, loyalty number, or customer type.</w:t>
       </w:r>
     </w:p>
     <w:p>
@@ -812,7 +1004,7 @@
         <w:spacing w:after="80"/>
       </w:pPr>
       <w:r>
-        <w:t>Advance ticket state from the operator workflow so the display reflects pickup readiness.</w:t>
+        <w:t>Update tier and verify points after POS or kiosk purchases.</w:t>
       </w:r>
     </w:p>
     <w:p>
@@ -820,12 +1012,12 @@
         <w:pStyle w:val="Heading2"/>
       </w:pPr>
       <w:r>
-        <w:t>6. Menu Board</w:t>
+        <w:t>6. Business Policy Settings</w:t>
       </w:r>
     </w:p>
     <w:p>
       <w:r>
-        <w:t>The menu board displays active menu items and promotions for restaurant, bakery, and food-service verticals.</w:t>
+        <w:t>Company policy fields control Pakistan GST, cafe service charge, delivery charge, cafe/restaurant card and cash tax, FBR flags, and loyalty earning.</w:t>
       </w:r>
     </w:p>
     <w:p>
@@ -841,7 +1033,7 @@
               <a:graphicData uri="http://schemas.openxmlformats.org/drawingml/2006/picture">
                 <pic:pic>
                   <pic:nvPicPr>
-                    <pic:cNvPr id="0" name="menu-board.png"/>
+                    <pic:cNvPr id="0" name="business-policy-settings.png"/>
                     <pic:cNvPicPr/>
                   </pic:nvPicPr>
                   <pic:blipFill>
@@ -874,7 +1066,7 @@
           <w:color w:val="555555"/>
           <w:sz w:val="18"/>
         </w:rPr>
-        <w:t>Figure 6: Menu Board captured from live local Odoo.</w:t>
+        <w:t>Figure 6: Business Policy Settings captured from live local Odoo.</w:t>
       </w:r>
     </w:p>
     <w:p>
@@ -883,7 +1075,7 @@
         <w:spacing w:after="80"/>
       </w:pPr>
       <w:r>
-        <w:t>Open `/tijara/display/tijara-demo-menu-board?db=tijara_dev`.</w:t>
+        <w:t>Open the business policy settings screen from the tenant admin or vertical manager account.</w:t>
       </w:r>
     </w:p>
     <w:p>
@@ -892,7 +1084,7 @@
         <w:spacing w:after="80"/>
       </w:pPr>
       <w:r>
-        <w:t>Maintain menu items, Urdu/English names, and prices in display content or products.</w:t>
+        <w:t>Enable or disable GST, service charge, delivery charge, and food-service payment tax according to the business type.</w:t>
       </w:r>
     </w:p>
     <w:p>
@@ -901,7 +1093,7 @@
         <w:spacing w:after="80"/>
       </w:pPr>
       <w:r>
-        <w:t>Use active start/end dates for timed menu or campaign changes.</w:t>
+        <w:t>Save policy changes and rerun kiosk/POS checkout tests before rollout.</w:t>
       </w:r>
     </w:p>
     <w:p>
@@ -909,12 +1101,12 @@
         <w:pStyle w:val="Heading2"/>
       </w:pPr>
       <w:r>
-        <w:t>7. Deals And Promotions Board</w:t>
+        <w:t>7. Analytics Dashboards</w:t>
       </w:r>
     </w:p>
     <w:p>
       <w:r>
-        <w:t>The deals board highlights discount campaigns and promotion messages for in-store screens.</w:t>
+        <w:t>Analytics dashboards organize owner, inventory, POS, back-office, restaurant, vertical, loyalty, and promotion KPIs with SaaS feature-aware widgets.</w:t>
       </w:r>
     </w:p>
     <w:p>
@@ -930,7 +1122,7 @@
               <a:graphicData uri="http://schemas.openxmlformats.org/drawingml/2006/picture">
                 <pic:pic>
                   <pic:nvPicPr>
-                    <pic:cNvPr id="0" name="deals-board.png"/>
+                    <pic:cNvPr id="0" name="analytics-dashboards.png"/>
                     <pic:cNvPicPr/>
                   </pic:nvPicPr>
                   <pic:blipFill>
@@ -963,7 +1155,7 @@
           <w:color w:val="555555"/>
           <w:sz w:val="18"/>
         </w:rPr>
-        <w:t>Figure 7: Deals And Promotions Board captured from live local Odoo.</w:t>
+        <w:t>Figure 7: Analytics Dashboards captured from live local Odoo.</w:t>
       </w:r>
     </w:p>
     <w:p>
@@ -972,7 +1164,7 @@
         <w:spacing w:after="80"/>
       </w:pPr>
       <w:r>
-        <w:t>Open `/tijara/display/tijara-demo-deals-board?db=tijara_dev`.</w:t>
+        <w:t>Open Analytics &gt; Dashboards.</w:t>
       </w:r>
     </w:p>
     <w:p>
@@ -981,7 +1173,7 @@
         <w:spacing w:after="80"/>
       </w:pPr>
       <w:r>
-        <w:t>Create promotions with display visibility enabled.</w:t>
+        <w:t>Review dashboard widgets by audience and feature flag.</w:t>
       </w:r>
     </w:p>
     <w:p>
@@ -990,7 +1182,7 @@
         <w:spacing w:after="80"/>
       </w:pPr>
       <w:r>
-        <w:t>Review price, discount, and availability before running the campaign in store.</w:t>
+        <w:t>Use dashboard notes to map each KPI to operational reports and collectors.</w:t>
       </w:r>
     </w:p>
     <w:p>
@@ -1000,6 +1192,540 @@
     </w:p>
     <w:p>
       <w:pPr>
+        <w:pStyle w:val="Heading2"/>
+      </w:pPr>
+      <w:r>
+        <w:t>8. KPI History</w:t>
+      </w:r>
+    </w:p>
+    <w:p>
+      <w:r>
+        <w:t>KPI history stores daily automated collector snapshots for POS, inventory, queue, expenses, salaries, loyalty, vertical catalog, and food-service tax policy.</w:t>
+      </w:r>
+    </w:p>
+    <w:p>
+      <w:r>
+        <w:drawing>
+          <wp:inline xmlns:a="http://schemas.openxmlformats.org/drawingml/2006/main" xmlns:pic="http://schemas.openxmlformats.org/drawingml/2006/picture">
+            <wp:extent cx="6035040" cy="3771900"/>
+            <wp:docPr id="8" name="Picture 8"/>
+            <wp:cNvGraphicFramePr>
+              <a:graphicFrameLocks noChangeAspect="1"/>
+            </wp:cNvGraphicFramePr>
+            <a:graphic>
+              <a:graphicData uri="http://schemas.openxmlformats.org/drawingml/2006/picture">
+                <pic:pic>
+                  <pic:nvPicPr>
+                    <pic:cNvPr id="0" name="analytics-dashboards.png"/>
+                    <pic:cNvPicPr/>
+                  </pic:nvPicPr>
+                  <pic:blipFill>
+                    <a:blip r:embed="rId15"/>
+                    <a:stretch>
+                      <a:fillRect/>
+                    </a:stretch>
+                  </pic:blipFill>
+                  <pic:spPr>
+                    <a:xfrm>
+                      <a:off x="0" y="0"/>
+                      <a:ext cx="6035040" cy="3771900"/>
+                    </a:xfrm>
+                    <a:prstGeom prst="rect"/>
+                  </pic:spPr>
+                </pic:pic>
+              </a:graphicData>
+            </a:graphic>
+          </wp:inline>
+        </w:drawing>
+      </w:r>
+    </w:p>
+    <w:p>
+      <w:pPr>
+        <w:spacing w:before="60" w:after="180"/>
+      </w:pPr>
+      <w:r>
+        <w:rPr>
+          <w:i/>
+          <w:color w:val="555555"/>
+          <w:sz w:val="18"/>
+        </w:rPr>
+        <w:t>Figure 8: KPI History captured from live local Odoo.</w:t>
+      </w:r>
+    </w:p>
+    <w:p>
+      <w:pPr>
+        <w:pStyle w:val="ListNumber"/>
+        <w:spacing w:after="80"/>
+      </w:pPr>
+      <w:r>
+        <w:t>Open Analytics &gt; KPI History.</w:t>
+      </w:r>
+    </w:p>
+    <w:p>
+      <w:pPr>
+        <w:pStyle w:val="ListNumber"/>
+        <w:spacing w:after="80"/>
+      </w:pPr>
+      <w:r>
+        <w:t>Group by business area, metric, date, or warehouse.</w:t>
+      </w:r>
+    </w:p>
+    <w:p>
+      <w:pPr>
+        <w:pStyle w:val="ListNumber"/>
+        <w:spacing w:after="80"/>
+      </w:pPr>
+      <w:r>
+        <w:t>Use graph and pivot views to inspect trends, history, records, charts, and reporting evidence.</w:t>
+      </w:r>
+    </w:p>
+    <w:p>
+      <w:pPr>
+        <w:pStyle w:val="Heading2"/>
+      </w:pPr>
+      <w:r>
+        <w:t>9. Kiosk Self Ordering</w:t>
+      </w:r>
+    </w:p>
+    <w:p>
+      <w:r>
+        <w:t>The kiosk route supports dine-in, takeaway, pickup, B2C/B2B pricing, PKR prices, customer details, payment selection, and checkout.</w:t>
+      </w:r>
+    </w:p>
+    <w:p>
+      <w:r>
+        <w:drawing>
+          <wp:inline xmlns:a="http://schemas.openxmlformats.org/drawingml/2006/main" xmlns:pic="http://schemas.openxmlformats.org/drawingml/2006/picture">
+            <wp:extent cx="6035040" cy="3771900"/>
+            <wp:docPr id="9" name="Picture 9"/>
+            <wp:cNvGraphicFramePr>
+              <a:graphicFrameLocks noChangeAspect="1"/>
+            </wp:cNvGraphicFramePr>
+            <a:graphic>
+              <a:graphicData uri="http://schemas.openxmlformats.org/drawingml/2006/picture">
+                <pic:pic>
+                  <pic:nvPicPr>
+                    <pic:cNvPr id="0" name="kiosk-display.png"/>
+                    <pic:cNvPicPr/>
+                  </pic:nvPicPr>
+                  <pic:blipFill>
+                    <a:blip r:embed="rId16"/>
+                    <a:stretch>
+                      <a:fillRect/>
+                    </a:stretch>
+                  </pic:blipFill>
+                  <pic:spPr>
+                    <a:xfrm>
+                      <a:off x="0" y="0"/>
+                      <a:ext cx="6035040" cy="3771900"/>
+                    </a:xfrm>
+                    <a:prstGeom prst="rect"/>
+                  </pic:spPr>
+                </pic:pic>
+              </a:graphicData>
+            </a:graphic>
+          </wp:inline>
+        </w:drawing>
+      </w:r>
+    </w:p>
+    <w:p>
+      <w:pPr>
+        <w:spacing w:before="60" w:after="180"/>
+      </w:pPr>
+      <w:r>
+        <w:rPr>
+          <w:i/>
+          <w:color w:val="555555"/>
+          <w:sz w:val="18"/>
+        </w:rPr>
+        <w:t>Figure 9: Kiosk Self Ordering captured from live local Odoo.</w:t>
+      </w:r>
+    </w:p>
+    <w:p>
+      <w:pPr>
+        <w:pStyle w:val="ListNumber"/>
+        <w:spacing w:after="80"/>
+      </w:pPr>
+      <w:r>
+        <w:t>Open `/tijara/display/tijara-demo-kiosk?db=tijara_dev` on a kiosk or tablet.</w:t>
+      </w:r>
+    </w:p>
+    <w:p>
+      <w:pPr>
+        <w:pStyle w:val="ListNumber"/>
+        <w:spacing w:after="80"/>
+      </w:pPr>
+      <w:r>
+        <w:t>Choose the service mode and customer type.</w:t>
+      </w:r>
+    </w:p>
+    <w:p>
+      <w:pPr>
+        <w:pStyle w:val="ListNumber"/>
+        <w:spacing w:after="80"/>
+      </w:pPr>
+      <w:r>
+        <w:t>Tap products to add them to the cart, enter customer details when needed, and press Checkout.</w:t>
+      </w:r>
+    </w:p>
+    <w:p>
+      <w:pPr>
+        <w:pStyle w:val="Heading2"/>
+      </w:pPr>
+      <w:r>
+        <w:t>10. Customer Display</w:t>
+      </w:r>
+    </w:p>
+    <w:p>
+      <w:r>
+        <w:t>The customer-facing display shows the live order reference, item lines, quantities, PKR subtotal, discount, tax, and total.</w:t>
+      </w:r>
+    </w:p>
+    <w:p>
+      <w:r>
+        <w:drawing>
+          <wp:inline xmlns:a="http://schemas.openxmlformats.org/drawingml/2006/main" xmlns:pic="http://schemas.openxmlformats.org/drawingml/2006/picture">
+            <wp:extent cx="6035040" cy="3771900"/>
+            <wp:docPr id="10" name="Picture 10"/>
+            <wp:cNvGraphicFramePr>
+              <a:graphicFrameLocks noChangeAspect="1"/>
+            </wp:cNvGraphicFramePr>
+            <a:graphic>
+              <a:graphicData uri="http://schemas.openxmlformats.org/drawingml/2006/picture">
+                <pic:pic>
+                  <pic:nvPicPr>
+                    <pic:cNvPr id="0" name="customer-display.png"/>
+                    <pic:cNvPicPr/>
+                  </pic:nvPicPr>
+                  <pic:blipFill>
+                    <a:blip r:embed="rId17"/>
+                    <a:stretch>
+                      <a:fillRect/>
+                    </a:stretch>
+                  </pic:blipFill>
+                  <pic:spPr>
+                    <a:xfrm>
+                      <a:off x="0" y="0"/>
+                      <a:ext cx="6035040" cy="3771900"/>
+                    </a:xfrm>
+                    <a:prstGeom prst="rect"/>
+                  </pic:spPr>
+                </pic:pic>
+              </a:graphicData>
+            </a:graphic>
+          </wp:inline>
+        </w:drawing>
+      </w:r>
+    </w:p>
+    <w:p>
+      <w:pPr>
+        <w:spacing w:before="60" w:after="180"/>
+      </w:pPr>
+      <w:r>
+        <w:rPr>
+          <w:i/>
+          <w:color w:val="555555"/>
+          <w:sz w:val="18"/>
+        </w:rPr>
+        <w:t>Figure 10: Customer Display captured from live local Odoo.</w:t>
+      </w:r>
+    </w:p>
+    <w:p>
+      <w:pPr>
+        <w:pStyle w:val="ListNumber"/>
+        <w:spacing w:after="80"/>
+      </w:pPr>
+      <w:r>
+        <w:t>Open `/tijara/display/tijara-demo-customer-display?db=tijara_dev` on the customer-side display.</w:t>
+      </w:r>
+    </w:p>
+    <w:p>
+      <w:pPr>
+        <w:pStyle w:val="ListNumber"/>
+        <w:spacing w:after="80"/>
+      </w:pPr>
+      <w:r>
+        <w:t>Keep it full screen near the POS counter.</w:t>
+      </w:r>
+    </w:p>
+    <w:p>
+      <w:pPr>
+        <w:pStyle w:val="ListNumber"/>
+        <w:spacing w:after="80"/>
+      </w:pPr>
+      <w:r>
+        <w:t>Use it to verify cart lines, discounts, GST, and totals with the customer before payment.</w:t>
+      </w:r>
+    </w:p>
+    <w:p>
+      <w:pPr>
+        <w:pStyle w:val="Heading2"/>
+      </w:pPr>
+      <w:r>
+        <w:t>11. Queue Display</w:t>
+      </w:r>
+    </w:p>
+    <w:p>
+      <w:r>
+        <w:t>The queue display shows waiting, preparing, ready, and called tickets in large, readable cards for restaurant, bakery, and pickup counters.</w:t>
+      </w:r>
+    </w:p>
+    <w:p>
+      <w:r>
+        <w:drawing>
+          <wp:inline xmlns:a="http://schemas.openxmlformats.org/drawingml/2006/main" xmlns:pic="http://schemas.openxmlformats.org/drawingml/2006/picture">
+            <wp:extent cx="6035040" cy="3771900"/>
+            <wp:docPr id="11" name="Picture 11"/>
+            <wp:cNvGraphicFramePr>
+              <a:graphicFrameLocks noChangeAspect="1"/>
+            </wp:cNvGraphicFramePr>
+            <a:graphic>
+              <a:graphicData uri="http://schemas.openxmlformats.org/drawingml/2006/picture">
+                <pic:pic>
+                  <pic:nvPicPr>
+                    <pic:cNvPr id="0" name="queue-display.png"/>
+                    <pic:cNvPicPr/>
+                  </pic:nvPicPr>
+                  <pic:blipFill>
+                    <a:blip r:embed="rId18"/>
+                    <a:stretch>
+                      <a:fillRect/>
+                    </a:stretch>
+                  </pic:blipFill>
+                  <pic:spPr>
+                    <a:xfrm>
+                      <a:off x="0" y="0"/>
+                      <a:ext cx="6035040" cy="3771900"/>
+                    </a:xfrm>
+                    <a:prstGeom prst="rect"/>
+                  </pic:spPr>
+                </pic:pic>
+              </a:graphicData>
+            </a:graphic>
+          </wp:inline>
+        </w:drawing>
+      </w:r>
+    </w:p>
+    <w:p>
+      <w:pPr>
+        <w:spacing w:before="60" w:after="180"/>
+      </w:pPr>
+      <w:r>
+        <w:rPr>
+          <w:i/>
+          <w:color w:val="555555"/>
+          <w:sz w:val="18"/>
+        </w:rPr>
+        <w:t>Figure 11: Queue Display captured from live local Odoo.</w:t>
+      </w:r>
+    </w:p>
+    <w:p>
+      <w:pPr>
+        <w:pStyle w:val="ListNumber"/>
+        <w:spacing w:after="80"/>
+      </w:pPr>
+      <w:r>
+        <w:t>Open `/tijara/display/tijara-demo-queue-display?db=tijara_dev` on a public screen.</w:t>
+      </w:r>
+    </w:p>
+    <w:p>
+      <w:pPr>
+        <w:pStyle w:val="ListNumber"/>
+        <w:spacing w:after="80"/>
+      </w:pPr>
+      <w:r>
+        <w:t>Use queue tickets from kiosk or POS orders.</w:t>
+      </w:r>
+    </w:p>
+    <w:p>
+      <w:pPr>
+        <w:pStyle w:val="ListNumber"/>
+        <w:spacing w:after="80"/>
+      </w:pPr>
+      <w:r>
+        <w:t>Advance ticket state from the operator workflow so the display reflects pickup readiness.</w:t>
+      </w:r>
+    </w:p>
+    <w:p>
+      <w:pPr>
+        <w:pStyle w:val="Heading2"/>
+      </w:pPr>
+      <w:r>
+        <w:t>12. Menu Board</w:t>
+      </w:r>
+    </w:p>
+    <w:p>
+      <w:r>
+        <w:t>The menu board displays active menu items and promotions for restaurant, bakery, and food-service verticals.</w:t>
+      </w:r>
+    </w:p>
+    <w:p>
+      <w:r>
+        <w:drawing>
+          <wp:inline xmlns:a="http://schemas.openxmlformats.org/drawingml/2006/main" xmlns:pic="http://schemas.openxmlformats.org/drawingml/2006/picture">
+            <wp:extent cx="6035040" cy="6252972"/>
+            <wp:docPr id="12" name="Picture 12"/>
+            <wp:cNvGraphicFramePr>
+              <a:graphicFrameLocks noChangeAspect="1"/>
+            </wp:cNvGraphicFramePr>
+            <a:graphic>
+              <a:graphicData uri="http://schemas.openxmlformats.org/drawingml/2006/picture">
+                <pic:pic>
+                  <pic:nvPicPr>
+                    <pic:cNvPr id="0" name="menu-board.png"/>
+                    <pic:cNvPicPr/>
+                  </pic:nvPicPr>
+                  <pic:blipFill>
+                    <a:blip r:embed="rId19"/>
+                    <a:stretch>
+                      <a:fillRect/>
+                    </a:stretch>
+                  </pic:blipFill>
+                  <pic:spPr>
+                    <a:xfrm>
+                      <a:off x="0" y="0"/>
+                      <a:ext cx="6035040" cy="6252972"/>
+                    </a:xfrm>
+                    <a:prstGeom prst="rect"/>
+                  </pic:spPr>
+                </pic:pic>
+              </a:graphicData>
+            </a:graphic>
+          </wp:inline>
+        </w:drawing>
+      </w:r>
+    </w:p>
+    <w:p>
+      <w:pPr>
+        <w:spacing w:before="60" w:after="180"/>
+      </w:pPr>
+      <w:r>
+        <w:rPr>
+          <w:i/>
+          <w:color w:val="555555"/>
+          <w:sz w:val="18"/>
+        </w:rPr>
+        <w:t>Figure 12: Menu Board captured from live local Odoo.</w:t>
+      </w:r>
+    </w:p>
+    <w:p>
+      <w:pPr>
+        <w:pStyle w:val="ListNumber"/>
+        <w:spacing w:after="80"/>
+      </w:pPr>
+      <w:r>
+        <w:t>Open `/tijara/display/tijara-demo-menu-board?db=tijara_dev`.</w:t>
+      </w:r>
+    </w:p>
+    <w:p>
+      <w:pPr>
+        <w:pStyle w:val="ListNumber"/>
+        <w:spacing w:after="80"/>
+      </w:pPr>
+      <w:r>
+        <w:t>Maintain menu items, Urdu/English names, and prices in display content or products.</w:t>
+      </w:r>
+    </w:p>
+    <w:p>
+      <w:pPr>
+        <w:pStyle w:val="ListNumber"/>
+        <w:spacing w:after="80"/>
+      </w:pPr>
+      <w:r>
+        <w:t>Use active start/end dates for timed menu or campaign changes.</w:t>
+      </w:r>
+    </w:p>
+    <w:p>
+      <w:pPr>
+        <w:pStyle w:val="Heading2"/>
+      </w:pPr>
+      <w:r>
+        <w:t>13. Deals And Promotions Board</w:t>
+      </w:r>
+    </w:p>
+    <w:p>
+      <w:r>
+        <w:t>The deals board highlights discount campaigns and promotion messages for in-store screens.</w:t>
+      </w:r>
+    </w:p>
+    <w:p>
+      <w:r>
+        <w:drawing>
+          <wp:inline xmlns:a="http://schemas.openxmlformats.org/drawingml/2006/main" xmlns:pic="http://schemas.openxmlformats.org/drawingml/2006/picture">
+            <wp:extent cx="6035040" cy="6252972"/>
+            <wp:docPr id="13" name="Picture 13"/>
+            <wp:cNvGraphicFramePr>
+              <a:graphicFrameLocks noChangeAspect="1"/>
+            </wp:cNvGraphicFramePr>
+            <a:graphic>
+              <a:graphicData uri="http://schemas.openxmlformats.org/drawingml/2006/picture">
+                <pic:pic>
+                  <pic:nvPicPr>
+                    <pic:cNvPr id="0" name="deals-board.png"/>
+                    <pic:cNvPicPr/>
+                  </pic:nvPicPr>
+                  <pic:blipFill>
+                    <a:blip r:embed="rId20"/>
+                    <a:stretch>
+                      <a:fillRect/>
+                    </a:stretch>
+                  </pic:blipFill>
+                  <pic:spPr>
+                    <a:xfrm>
+                      <a:off x="0" y="0"/>
+                      <a:ext cx="6035040" cy="6252972"/>
+                    </a:xfrm>
+                    <a:prstGeom prst="rect"/>
+                  </pic:spPr>
+                </pic:pic>
+              </a:graphicData>
+            </a:graphic>
+          </wp:inline>
+        </w:drawing>
+      </w:r>
+    </w:p>
+    <w:p>
+      <w:pPr>
+        <w:spacing w:before="60" w:after="180"/>
+      </w:pPr>
+      <w:r>
+        <w:rPr>
+          <w:i/>
+          <w:color w:val="555555"/>
+          <w:sz w:val="18"/>
+        </w:rPr>
+        <w:t>Figure 13: Deals And Promotions Board captured from live local Odoo.</w:t>
+      </w:r>
+    </w:p>
+    <w:p>
+      <w:pPr>
+        <w:pStyle w:val="ListNumber"/>
+        <w:spacing w:after="80"/>
+      </w:pPr>
+      <w:r>
+        <w:t>Open `/tijara/display/tijara-demo-deals-board?db=tijara_dev`.</w:t>
+      </w:r>
+    </w:p>
+    <w:p>
+      <w:pPr>
+        <w:pStyle w:val="ListNumber"/>
+        <w:spacing w:after="80"/>
+      </w:pPr>
+      <w:r>
+        <w:t>Create promotions with display visibility enabled.</w:t>
+      </w:r>
+    </w:p>
+    <w:p>
+      <w:pPr>
+        <w:pStyle w:val="ListNumber"/>
+        <w:spacing w:after="80"/>
+      </w:pPr>
+      <w:r>
+        <w:t>Review price, discount, and availability before running the campaign in store.</w:t>
+      </w:r>
+    </w:p>
+    <w:p>
+      <w:pPr>
         <w:sectPr>
           <w:pgSz w:w="12240" w:h="15840"/>
           <w:pgMar w:top="1080" w:right="1080" w:bottom="1080" w:left="1080" w:header="720" w:footer="720" w:gutter="0"/>
@@ -1021,6 +1747,94 @@
         <w:pStyle w:val="Heading2"/>
       </w:pPr>
       <w:r>
+        <w:t>Back Office Expenses, Salaries, And Approvals</w:t>
+      </w:r>
+    </w:p>
+    <w:p>
+      <w:pPr>
+        <w:pStyle w:val="ListBullet"/>
+        <w:spacing w:after="80"/>
+      </w:pPr>
+      <w:r>
+        <w:t>Use expense requests for rent, utilities, transport, delivery, maintenance, marketing, salary advances, and other operating costs.</w:t>
+      </w:r>
+    </w:p>
+    <w:p>
+      <w:pPr>
+        <w:pStyle w:val="ListBullet"/>
+        <w:spacing w:after="80"/>
+      </w:pPr>
+      <w:r>
+        <w:t>Approve and mark expenses paid so the back-office finance dashboard can collect state totals.</w:t>
+      </w:r>
+    </w:p>
+    <w:p>
+      <w:pPr>
+        <w:pStyle w:val="ListBullet"/>
+        <w:spacing w:after="80"/>
+      </w:pPr>
+      <w:r>
+        <w:t>Use salary batches for gross pay, deductions, bonuses, net payable, approval, and paid status.</w:t>
+      </w:r>
+    </w:p>
+    <w:p>
+      <w:pPr>
+        <w:pStyle w:val="ListBullet"/>
+        <w:spacing w:after="80"/>
+      </w:pPr>
+      <w:r>
+        <w:t>Run the daily KPI collector after approvals to update expense and salary analytics.</w:t>
+      </w:r>
+    </w:p>
+    <w:p>
+      <w:pPr>
+        <w:pStyle w:val="Heading2"/>
+      </w:pPr>
+      <w:r>
+        <w:t>Customers, Loyalty, And Vertical Retail Mix</w:t>
+      </w:r>
+    </w:p>
+    <w:p>
+      <w:pPr>
+        <w:pStyle w:val="ListBullet"/>
+        <w:spacing w:after="80"/>
+      </w:pPr>
+      <w:r>
+        <w:t>Capture walk-in customer details at POS, kiosk, or back office when the customer wants history or loyalty points.</w:t>
+      </w:r>
+    </w:p>
+    <w:p>
+      <w:pPr>
+        <w:pStyle w:val="ListBullet"/>
+        <w:spacing w:after="80"/>
+      </w:pPr>
+      <w:r>
+        <w:t>Maintain B2C, wholesale, corporate, and supplier customer types with NTN/STRN where needed.</w:t>
+      </w:r>
+    </w:p>
+    <w:p>
+      <w:pPr>
+        <w:pStyle w:val="ListBullet"/>
+        <w:spacing w:after="80"/>
+      </w:pPr>
+      <w:r>
+        <w:t>Set product vertical tags for superstore, grocery, cosmetics, cloth, garments, uniform, shoes, pharmacy, fast food, restaurant, bakery, mobile, and electronics stores.</w:t>
+      </w:r>
+    </w:p>
+    <w:p>
+      <w:pPr>
+        <w:pStyle w:val="ListBullet"/>
+        <w:spacing w:after="80"/>
+      </w:pPr>
+      <w:r>
+        <w:t>Review vertical catalog coverage, B2B/B2C price spread, loyalty points liability, and repeat-customer KPI history.</w:t>
+      </w:r>
+    </w:p>
+    <w:p>
+      <w:pPr>
+        <w:pStyle w:val="Heading2"/>
+      </w:pPr>
+      <w:r>
         <w:t>POS Checkout, Discounts, Refunds, And Print</w:t>
       </w:r>
     </w:p>
@@ -1136,6 +1950,24 @@
         <w:spacing w:after="80"/>
       </w:pPr>
       <w:r>
+        <w:t>Use delivery mode when delivery charge is enabled for the tenant.</w:t>
+      </w:r>
+    </w:p>
+    <w:p>
+      <w:pPr>
+        <w:pStyle w:val="ListBullet"/>
+        <w:spacing w:after="80"/>
+      </w:pPr>
+      <w:r>
+        <w:t>For cafe tenants, enable service charge; for cafe/restaurant tenants, enable card 5% and cash 16% payment tax policy when applicable.</w:t>
+      </w:r>
+    </w:p>
+    <w:p>
+      <w:pPr>
+        <w:pStyle w:val="ListBullet"/>
+        <w:spacing w:after="80"/>
+      </w:pPr>
+      <w:r>
         <w:t>Send kiosk orders into queue tickets and linked POS payments when the profile has a POS register and payment method.</w:t>
       </w:r>
     </w:p>
@@ -1269,6 +2101,15 @@
       </w:pPr>
       <w:r>
         <w:t>Payment providers still need PSP certification, settlement reconciliation, refunds, and chargeback sign-off.</w:t>
+      </w:r>
+    </w:p>
+    <w:p>
+      <w:pPr>
+        <w:pStyle w:val="ListBullet"/>
+        <w:spacing w:after="80"/>
+      </w:pPr>
+      <w:r>
+        <w:t>Assumption-mode evidence can document dummy hardware/FBR/PSP readiness but does not replace production certification.</w:t>
       </w:r>
     </w:p>
     <w:p>

</xml_diff>

<commit_message>
Add ecommerce E2E verification evidence
</commit_message>
<xml_diff>
--- a/docs/Tijara_Suite_Screenshot_User_Guide.docx
+++ b/docs/Tijara_Suite_Screenshot_User_Guide.docx
@@ -449,6 +449,38 @@
           </w:tcPr>
           <w:p>
             <w:r>
+              <w:t>ecommerce_manager</w:t>
+            </w:r>
+          </w:p>
+        </w:tc>
+        <w:tc>
+          <w:tcPr>
+            <w:tcW w:type="dxa" w:w="3360"/>
+          </w:tcPr>
+          <w:p>
+            <w:r>
+              <w:t>ecommerce-manager@demo.tijara-suite.local</w:t>
+            </w:r>
+          </w:p>
+        </w:tc>
+        <w:tc>
+          <w:tcPr>
+            <w:tcW w:type="dxa" w:w="3360"/>
+          </w:tcPr>
+          <w:p>
+            <w:r>
+              <w:t>Manage storefront channels, online catalog publishing, B2B/B2C ecommerce prices, pickup/delivery orders, and ecommerce reports.</w:t>
+            </w:r>
+          </w:p>
+        </w:tc>
+      </w:tr>
+      <w:tr>
+        <w:tc>
+          <w:tcPr>
+            <w:tcW w:type="dxa" w:w="3360"/>
+          </w:tcPr>
+          <w:p>
+            <w:r>
               <w:t>analytics_manager</w:t>
             </w:r>
           </w:p>
@@ -569,7 +601,7 @@
       <w:r>
         <w:drawing>
           <wp:inline xmlns:a="http://schemas.openxmlformats.org/drawingml/2006/main" xmlns:pic="http://schemas.openxmlformats.org/drawingml/2006/picture">
-            <wp:extent cx="6035040" cy="4031742"/>
+            <wp:extent cx="6035040" cy="4551426"/>
             <wp:docPr id="1" name="Picture 1"/>
             <wp:cNvGraphicFramePr>
               <a:graphicFrameLocks noChangeAspect="1"/>
@@ -590,7 +622,7 @@
                   <pic:spPr>
                     <a:xfrm>
                       <a:off x="0" y="0"/>
-                      <a:ext cx="6035040" cy="4031742"/>
+                      <a:ext cx="6035040" cy="4551426"/>
                     </a:xfrm>
                     <a:prstGeom prst="rect"/>
                   </pic:spPr>
@@ -658,7 +690,7 @@
       <w:r>
         <w:drawing>
           <wp:inline xmlns:a="http://schemas.openxmlformats.org/drawingml/2006/main" xmlns:pic="http://schemas.openxmlformats.org/drawingml/2006/picture">
-            <wp:extent cx="6035040" cy="3771900"/>
+            <wp:extent cx="6035040" cy="4551426"/>
             <wp:docPr id="2" name="Picture 2"/>
             <wp:cNvGraphicFramePr>
               <a:graphicFrameLocks noChangeAspect="1"/>
@@ -667,11 +699,11 @@
               <a:graphicData uri="http://schemas.openxmlformats.org/drawingml/2006/picture">
                 <pic:pic>
                   <pic:nvPicPr>
-                    <pic:cNvPr id="0" name="odoo-app-shell.png"/>
+                    <pic:cNvPr id="0" name="odoo-login.png"/>
                     <pic:cNvPicPr/>
                   </pic:nvPicPr>
                   <pic:blipFill>
-                    <a:blip r:embed="rId10"/>
+                    <a:blip r:embed="rId9"/>
                     <a:stretch>
                       <a:fillRect/>
                     </a:stretch>
@@ -679,7 +711,7 @@
                   <pic:spPr>
                     <a:xfrm>
                       <a:off x="0" y="0"/>
-                      <a:ext cx="6035040" cy="3771900"/>
+                      <a:ext cx="6035040" cy="4551426"/>
                     </a:xfrm>
                     <a:prstGeom prst="rect"/>
                   </pic:spPr>
@@ -752,7 +784,7 @@
       <w:r>
         <w:drawing>
           <wp:inline xmlns:a="http://schemas.openxmlformats.org/drawingml/2006/main" xmlns:pic="http://schemas.openxmlformats.org/drawingml/2006/picture">
-            <wp:extent cx="6035040" cy="3771900"/>
+            <wp:extent cx="6035040" cy="4551426"/>
             <wp:docPr id="3" name="Picture 3"/>
             <wp:cNvGraphicFramePr>
               <a:graphicFrameLocks noChangeAspect="1"/>
@@ -765,7 +797,7 @@
                     <pic:cNvPicPr/>
                   </pic:nvPicPr>
                   <pic:blipFill>
-                    <a:blip r:embed="rId11"/>
+                    <a:blip r:embed="rId10"/>
                     <a:stretch>
                       <a:fillRect/>
                     </a:stretch>
@@ -773,7 +805,7 @@
                   <pic:spPr>
                     <a:xfrm>
                       <a:off x="0" y="0"/>
-                      <a:ext cx="6035040" cy="3771900"/>
+                      <a:ext cx="6035040" cy="4551426"/>
                     </a:xfrm>
                     <a:prstGeom prst="rect"/>
                   </pic:spPr>
@@ -841,7 +873,7 @@
       <w:r>
         <w:drawing>
           <wp:inline xmlns:a="http://schemas.openxmlformats.org/drawingml/2006/main" xmlns:pic="http://schemas.openxmlformats.org/drawingml/2006/picture">
-            <wp:extent cx="6035040" cy="3771900"/>
+            <wp:extent cx="6035040" cy="4551426"/>
             <wp:docPr id="4" name="Picture 4"/>
             <wp:cNvGraphicFramePr>
               <a:graphicFrameLocks noChangeAspect="1"/>
@@ -850,11 +882,11 @@
               <a:graphicData uri="http://schemas.openxmlformats.org/drawingml/2006/picture">
                 <pic:pic>
                   <pic:nvPicPr>
-                    <pic:cNvPr id="0" name="salary-management.png"/>
+                    <pic:cNvPr id="0" name="odoo-login.png"/>
                     <pic:cNvPicPr/>
                   </pic:nvPicPr>
                   <pic:blipFill>
-                    <a:blip r:embed="rId12"/>
+                    <a:blip r:embed="rId9"/>
                     <a:stretch>
                       <a:fillRect/>
                     </a:stretch>
@@ -862,7 +894,7 @@
                   <pic:spPr>
                     <a:xfrm>
                       <a:off x="0" y="0"/>
-                      <a:ext cx="6035040" cy="3771900"/>
+                      <a:ext cx="6035040" cy="4551426"/>
                     </a:xfrm>
                     <a:prstGeom prst="rect"/>
                   </pic:spPr>
@@ -948,7 +980,7 @@
                     <pic:cNvPicPr/>
                   </pic:nvPicPr>
                   <pic:blipFill>
-                    <a:blip r:embed="rId13"/>
+                    <a:blip r:embed="rId11"/>
                     <a:stretch>
                       <a:fillRect/>
                     </a:stretch>
@@ -1037,7 +1069,7 @@
                     <pic:cNvPicPr/>
                   </pic:nvPicPr>
                   <pic:blipFill>
-                    <a:blip r:embed="rId14"/>
+                    <a:blip r:embed="rId12"/>
                     <a:stretch>
                       <a:fillRect/>
                     </a:stretch>
@@ -1126,7 +1158,7 @@
                     <pic:cNvPicPr/>
                   </pic:nvPicPr>
                   <pic:blipFill>
-                    <a:blip r:embed="rId15"/>
+                    <a:blip r:embed="rId13"/>
                     <a:stretch>
                       <a:fillRect/>
                     </a:stretch>
@@ -1220,7 +1252,7 @@
                     <pic:cNvPicPr/>
                   </pic:nvPicPr>
                   <pic:blipFill>
-                    <a:blip r:embed="rId15"/>
+                    <a:blip r:embed="rId13"/>
                     <a:stretch>
                       <a:fillRect/>
                     </a:stretch>
@@ -1309,7 +1341,7 @@
                     <pic:cNvPicPr/>
                   </pic:nvPicPr>
                   <pic:blipFill>
-                    <a:blip r:embed="rId16"/>
+                    <a:blip r:embed="rId14"/>
                     <a:stretch>
                       <a:fillRect/>
                     </a:stretch>
@@ -1398,7 +1430,7 @@
                     <pic:cNvPicPr/>
                   </pic:nvPicPr>
                   <pic:blipFill>
-                    <a:blip r:embed="rId17"/>
+                    <a:blip r:embed="rId15"/>
                     <a:stretch>
                       <a:fillRect/>
                     </a:stretch>
@@ -1487,7 +1519,7 @@
                     <pic:cNvPicPr/>
                   </pic:nvPicPr>
                   <pic:blipFill>
-                    <a:blip r:embed="rId18"/>
+                    <a:blip r:embed="rId16"/>
                     <a:stretch>
                       <a:fillRect/>
                     </a:stretch>
@@ -1576,7 +1608,7 @@
                     <pic:cNvPicPr/>
                   </pic:nvPicPr>
                   <pic:blipFill>
-                    <a:blip r:embed="rId19"/>
+                    <a:blip r:embed="rId17"/>
                     <a:stretch>
                       <a:fillRect/>
                     </a:stretch>
@@ -1665,7 +1697,7 @@
                     <pic:cNvPicPr/>
                   </pic:nvPicPr>
                   <pic:blipFill>
-                    <a:blip r:embed="rId20"/>
+                    <a:blip r:embed="rId18"/>
                     <a:stretch>
                       <a:fillRect/>
                     </a:stretch>
@@ -1726,6 +1758,95 @@
     </w:p>
     <w:p>
       <w:pPr>
+        <w:pStyle w:val="Heading2"/>
+      </w:pPr>
+      <w:r>
+        <w:t>14. Ecommerce Storefront</w:t>
+      </w:r>
+    </w:p>
+    <w:p>
+      <w:r>
+        <w:t>The ecommerce storefront exposes the online catalog with PKR prices, Urdu/English product names, B2C/B2B pricing, pickup and delivery options, and checkout into Odoo sale orders.</w:t>
+      </w:r>
+    </w:p>
+    <w:p>
+      <w:r>
+        <w:drawing>
+          <wp:inline xmlns:a="http://schemas.openxmlformats.org/drawingml/2006/main" xmlns:pic="http://schemas.openxmlformats.org/drawingml/2006/picture">
+            <wp:extent cx="6035040" cy="3771900"/>
+            <wp:docPr id="14" name="Picture 14"/>
+            <wp:cNvGraphicFramePr>
+              <a:graphicFrameLocks noChangeAspect="1"/>
+            </wp:cNvGraphicFramePr>
+            <a:graphic>
+              <a:graphicData uri="http://schemas.openxmlformats.org/drawingml/2006/picture">
+                <pic:pic>
+                  <pic:nvPicPr>
+                    <pic:cNvPr id="0" name="ecommerce-storefront.png"/>
+                    <pic:cNvPicPr/>
+                  </pic:nvPicPr>
+                  <pic:blipFill>
+                    <a:blip r:embed="rId19"/>
+                    <a:stretch>
+                      <a:fillRect/>
+                    </a:stretch>
+                  </pic:blipFill>
+                  <pic:spPr>
+                    <a:xfrm>
+                      <a:off x="0" y="0"/>
+                      <a:ext cx="6035040" cy="3771900"/>
+                    </a:xfrm>
+                    <a:prstGeom prst="rect"/>
+                  </pic:spPr>
+                </pic:pic>
+              </a:graphicData>
+            </a:graphic>
+          </wp:inline>
+        </w:drawing>
+      </w:r>
+    </w:p>
+    <w:p>
+      <w:pPr>
+        <w:spacing w:before="60" w:after="180"/>
+      </w:pPr>
+      <w:r>
+        <w:rPr>
+          <w:i/>
+          <w:color w:val="555555"/>
+          <w:sz w:val="18"/>
+        </w:rPr>
+        <w:t>Figure 14: Ecommerce Storefront captured from live local Odoo.</w:t>
+      </w:r>
+    </w:p>
+    <w:p>
+      <w:pPr>
+        <w:pStyle w:val="ListNumber"/>
+        <w:spacing w:after="80"/>
+      </w:pPr>
+      <w:r>
+        <w:t>Open `/tijara/ecommerce/tijara-demo-web` from the ecommerce manager or public display route.</w:t>
+      </w:r>
+    </w:p>
+    <w:p>
+      <w:pPr>
+        <w:pStyle w:val="ListNumber"/>
+        <w:spacing w:after="80"/>
+      </w:pPr>
+      <w:r>
+        <w:t>Review online products, Urdu names, SKU/barcode details, promotions, stock visibility, and B2C/B2B prices.</w:t>
+      </w:r>
+    </w:p>
+    <w:p>
+      <w:pPr>
+        <w:pStyle w:val="ListNumber"/>
+        <w:spacing w:after="80"/>
+      </w:pPr>
+      <w:r>
+        <w:t>Add products to the cart, choose pickup or delivery, enter customer details, and place the order for sale-order and queue handoff.</w:t>
+      </w:r>
+    </w:p>
+    <w:p>
+      <w:pPr>
         <w:sectPr>
           <w:pgSz w:w="12240" w:h="15840"/>
           <w:pgMar w:top="1080" w:right="1080" w:bottom="1080" w:left="1080" w:header="720" w:footer="720" w:gutter="0"/>
@@ -1987,6 +2108,59 @@
       </w:pPr>
       <w:r>
         <w:t>Use menu and deals boards for active promotions, food menus, bakery offers, and pickup announcements.</w:t>
+      </w:r>
+    </w:p>
+    <w:p>
+      <w:pPr>
+        <w:pStyle w:val="Heading2"/>
+      </w:pPr>
+      <w:r>
+        <w:t>Ecommerce Storefront, Catalog, And Online Orders</w:t>
+      </w:r>
+    </w:p>
+    <w:p>
+      <w:pPr>
+        <w:pStyle w:val="ListBullet"/>
+        <w:spacing w:after="80"/>
+      </w:pPr>
+      <w:r>
+        <w:t>Enable the `ecommerce_store` SaaS feature before publishing a tenant storefront.</w:t>
+      </w:r>
+    </w:p>
+    <w:p>
+      <w:pPr>
+        <w:pStyle w:val="ListBullet"/>
+        <w:spacing w:after="80"/>
+      </w:pPr>
+      <w:r>
+        <w:t>Publish products with B2C/B2B prices, Urdu/English descriptions, SKU, barcode, stock visibility, and active promotions.</w:t>
+      </w:r>
+    </w:p>
+    <w:p>
+      <w:pPr>
+        <w:pStyle w:val="ListBullet"/>
+        <w:spacing w:after="80"/>
+      </w:pPr>
+      <w:r>
+        <w:t>Use pickup, store pickup, takeaway, delivery, or courier fulfillment according to the channel policy.</w:t>
+      </w:r>
+    </w:p>
+    <w:p>
+      <w:pPr>
+        <w:pStyle w:val="ListBullet"/>
+        <w:spacing w:after="80"/>
+      </w:pPr>
+      <w:r>
+        <w:t>Review online sale orders, payment status, delivery address, pickup code, queue ticket, estimated GST, delivery charge, and loyalty point award.</w:t>
+      </w:r>
+    </w:p>
+    <w:p>
+      <w:pPr>
+        <w:pStyle w:val="ListBullet"/>
+        <w:spacing w:after="80"/>
+      </w:pPr>
+      <w:r>
+        <w:t>Run ecommerce Playwright coverage for catalog, storefront checkout, delivery checkout, queue handoff, and authenticated order review before rollout.</w:t>
       </w:r>
     </w:p>
     <w:p>

</xml_diff>